<commit_message>
Implement PRD v1.2: general all-domains search, direct in-site purchase, coverage & My Domains
- General (all-domains) scan is now the default: primary "check all domains" action runs
  immediately with no topic/keyword/length/language constraints; those become optional filters.
- Coverage transparency panel: sources checked, TLDs covered, candidate count, failures, partial flag.
- General-search scoring drops the topic-relevance component and renormalizes weights to 100%;
  no penalty for sector mismatch; estimated market range shown only when comparable-sales data exists.
- Direct in-site purchase (§8.1): buy button opens a re-verified quote (price/taxes/fees/renewal/
  owner), requires explicit confirmation, resolves a purchase path per status, and handles the
  timeout -> "unknown" state with reconciliation before retry.
- New "My Domains" screen (S-13) for verified purchases; new-name vs. history separation (AC-15).

Co-Authored-By: Claude Opus 4.8 <noreply@anthropic.com>
</commit_message>
<xml_diff>
--- a/docs/domain-opportunity-system-spec-he.docx
+++ b/docs/domain-opportunity-system-spec-he.docx
@@ -147,7 +147,7 @@
           <w:color w:val="5C677D"/>
           <w:sz w:val="20"/>
         </w:rPr>
-        <w:t>גרסה 1.0  |  16 בספטמבר 2026</w:t>
+        <w:t>גרסה 1.2  |  16 בספטמבר 2026</w:t>
       </w:r>
     </w:p>
     <w:p>
@@ -192,7 +192,7 @@
         <w:rPr>
           <w:rFonts w:ascii="Arial" w:hAnsi="Arial" w:cs="Arial"/>
         </w:rPr>
-        <w:t>המערכת מיועדת למשתמש שאינו רוצה לעסוק בחיפוש ידני אחר דומיינים. המשתמש נותן הוראה בשפה חופשית, לדוגמה: “מצא לי דומיינים קצרים באנגלית בתחום ההגירה, עד 500 דולר, עם סיומת com”, והמערכת הופכת אותה למסננים, סורקת מקורות, בודקת את מצב הדומיינים, מדרגת כל הזדמנות ומציגה רק תוצאות שעברו את סף האיכות והסיכון.</w:t>
+        <w:t>המערכת מיועדת למשתמש שאינו רוצה לעסוק בחיפוש ידני אחר דומיינים. המשתמש נותן הוראה בשפה חופשית, לדוגמה: “מצא לי בכל התחומים דומיינים בהזדמנות לקנייה, עד 500 דולר, בכל הסיומות הנתמכות”, והמערכת הופכת אותה למסננים, סורקת מקורות, בודקת את מצב הדומיינים, מדרגת כל הזדמנות ומציגה רק תוצאות שעברו את סף האיכות והסיכון.</w:t>
       </w:r>
     </w:p>
     <w:tbl>
@@ -270,6 +270,30 @@
           <w:b/>
         </w:rPr>
         <w:t>1.1 מטרות</w:t>
+      </w:r>
+    </w:p>
+    <w:p>
+      <w:pPr>
+        <w:jc w:val="right"/>
+        <w:bidi w:val="1"/>
+      </w:pPr>
+      <w:r>
+        <w:rPr>
+          <w:rFonts w:ascii="Arial" w:hAnsi="Arial" w:cs="Arial"/>
+        </w:rPr>
+        <w:t>ברירת המחדל היא סריקה כללית בכל התחומים, ללא מילות מפתח, הגבלת אורך או שפה. תחום, שפה וסיומת הם מסננים אופציונליים בלבד. מסך הבית יכלול פעולה ראשית: בדוק הזדמנויות בכל הדומיינים. לחיצה מפעילה את הבדיקה מיד לפי הפרופיל, ללא אישור פרשנות נוסף כאשר אין עמימות.</w:t>
+      </w:r>
+    </w:p>
+    <w:p>
+      <w:pPr>
+        <w:jc w:val="right"/>
+        <w:bidi w:val="1"/>
+      </w:pPr>
+      <w:r>
+        <w:rPr>
+          <w:rFonts w:ascii="Arial" w:hAnsi="Arial" w:cs="Arial"/>
+        </w:rPr>
+        <w:t>הכיסוי כולל את כל הרשומות הזמינות בפידים ובמקורות המחוברים ובסיומות הנתמכות בהם. אין משמעות מעשית לסריקת כל צירופי השמות האפשריים בעולם, ואין להבטיח כיסוי מלא של כל הרשמים. המערכת תציג מקורות שנבדקו, סיומות מכוסות, מספר מועמדים, תאריך עדכון וכשלים. תוצאה חלקית תסומן כחלקית; אפס תוצאות אינו הוכחה שאין הזדמנויות בשוק.</w:t>
       </w:r>
     </w:p>
     <w:p>
@@ -940,7 +964,7 @@
                 <w:color w:val="17202A"/>
                 <w:sz w:val="17"/>
               </w:rPr>
-              <w:t>.com, .co, .io</w:t>
+              <w:t>כל הסיומות הנתמכות; סינון אופציונלי</w:t>
             </w:r>
           </w:p>
         </w:tc>
@@ -974,7 +998,7 @@
                 <w:color w:val="17202A"/>
                 <w:sz w:val="17"/>
               </w:rPr>
-              <w:t>כן</w:t>
+              <w:t>לא</w:t>
             </w:r>
           </w:p>
         </w:tc>
@@ -1045,7 +1069,7 @@
                 <w:color w:val="17202A"/>
                 <w:sz w:val="17"/>
               </w:rPr>
-              <w:t>הגירה, משפטים, נדל״ן, טכנולוגיה</w:t>
+              <w:t>כל התחומים; סינון אופציונלי</w:t>
             </w:r>
           </w:p>
         </w:tc>
@@ -1078,7 +1102,7 @@
                 <w:color w:val="17202A"/>
                 <w:sz w:val="17"/>
               </w:rPr>
-              <w:t>כן</w:t>
+              <w:t>לא</w:t>
             </w:r>
           </w:p>
         </w:tc>
@@ -1577,7 +1601,7 @@
                 <w:color w:val="17202A"/>
                 <w:sz w:val="20"/>
               </w:rPr>
-              <w:t>“מצא לי במשך 14 יום דומיינים באנגלית בתחום הוויזות וההגירה, עד 12 תווים, רק com, בתקציב של עד 750 דולר. תציג רק תוצאות בציון 80 ומעלה ותתריע מיד על דומיין שעובר לצב Pending Delete או הופך לפנוי.”</w:t>
+              <w:t>“מצא לי במשך 14 יום דומיינים בהזדמנות בכל התחומים ובכל הסיומות הנתמכות, בתקציב של עד 750 דולר. תציג רק תוצאות בציון 80 ומעלה ותתריע מיד על דומיין שעובר למצב Pending Delete או הופך לפנוי.”</w:t>
             </w:r>
           </w:p>
         </w:tc>
@@ -5476,7 +5500,7 @@
                 <w:color w:val="17202A"/>
                 <w:sz w:val="17"/>
               </w:rPr>
-              <w:t>רישום דרך API, Backorder או מעבר למכרז; גבולות תקציב והרשאות.</w:t>
+              <w:t>רישום דרך API, קנייה ישירה באתר באמצעות API, הזמנה ואימות בעלות; מכרז ו-Backorder לפי תמיכת ספק.</w:t>
             </w:r>
           </w:p>
         </w:tc>
@@ -6169,7 +6193,7 @@
                 <w:color w:val="17202A"/>
                 <w:sz w:val="17"/>
               </w:rPr>
-              <w:t>דומיינים להגירה - ספטמבר</w:t>
+              <w:t>הזדמנויות בכל התחומים - ספטמבר</w:t>
             </w:r>
           </w:p>
         </w:tc>
@@ -6242,7 +6266,7 @@
                 <w:color w:val="17202A"/>
                 <w:sz w:val="17"/>
               </w:rPr>
-              <w:t>רשימה</w:t>
+              <w:t>רשימה אופציונלית</w:t>
             </w:r>
           </w:p>
         </w:tc>
@@ -6276,7 +6300,7 @@
                 <w:color w:val="17202A"/>
                 <w:sz w:val="17"/>
               </w:rPr>
-              <w:t>visa, migrate, global, legal</w:t>
+              <w:t>ריקה בחיפוש כללי</w:t>
             </w:r>
           </w:p>
         </w:tc>
@@ -6347,7 +6371,7 @@
                 <w:color w:val="17202A"/>
                 <w:sz w:val="17"/>
               </w:rPr>
-              <w:t>רשימה</w:t>
+              <w:t>רשימה אופציונלית</w:t>
             </w:r>
           </w:p>
         </w:tc>
@@ -6380,7 +6404,7 @@
                 <w:color w:val="17202A"/>
                 <w:sz w:val="17"/>
               </w:rPr>
-              <w:t>immigration services, relocation</w:t>
+              <w:t>ריקה = כל התחומים</w:t>
             </w:r>
           </w:p>
         </w:tc>
@@ -6453,7 +6477,7 @@
                 <w:color w:val="17202A"/>
                 <w:sz w:val="17"/>
               </w:rPr>
-              <w:t>ערך</w:t>
+              <w:t>ערך אופציונלי</w:t>
             </w:r>
           </w:p>
         </w:tc>
@@ -6487,7 +6511,7 @@
                 <w:color w:val="17202A"/>
                 <w:sz w:val="17"/>
               </w:rPr>
-              <w:t>English</w:t>
+              <w:t>ללא הגבלה</w:t>
             </w:r>
           </w:p>
         </w:tc>
@@ -6591,7 +6615,7 @@
                 <w:color w:val="17202A"/>
                 <w:sz w:val="17"/>
               </w:rPr>
-              <w:t>.com</w:t>
+              <w:t>כל הסיומות הנתמכות</w:t>
             </w:r>
           </w:p>
         </w:tc>
@@ -6664,7 +6688,7 @@
                 <w:color w:val="17202A"/>
                 <w:sz w:val="17"/>
               </w:rPr>
-              <w:t>מספר</w:t>
+              <w:t>מספר אופציונלי</w:t>
             </w:r>
           </w:p>
         </w:tc>
@@ -6698,7 +6722,7 @@
                 <w:color w:val="17202A"/>
                 <w:sz w:val="17"/>
               </w:rPr>
-              <w:t>12</w:t>
+              <w:t>ללא הגבלה</w:t>
             </w:r>
           </w:p>
         </w:tc>
@@ -8569,6 +8593,18 @@
     </w:p>
     <w:p>
       <w:pPr>
+        <w:jc w:val="right"/>
+        <w:bidi w:val="1"/>
+      </w:pPr>
+      <w:r>
+        <w:rPr>
+          <w:rFonts w:ascii="Arial" w:hAnsi="Arial" w:cs="Arial"/>
+        </w:rPr>
+        <w:t>בחיפוש כללי משקל ההתאמה לתחום אינו מחושב. יתר המשקלים מנורמלים ל-100%; הדומיין לא ייענש משום שאינו קשור להגירה או לענף אחר. סיווג אוטומטי לענפים נועד לארגון התוצאות בלבד ואינו מסנן מועמדים. שם זול או ציון גבוה לבדם אינם הוכחה להזדמנות במחיר: כאשר קיימים נתוני עסקאות השוואה, יוצגו טווח מחיר משוער, מקור ותאריך. בהיעדרם יוצג שם מתאים בתקציב, ללא טענה להנחה או לרווח מובטח.</w:t>
+      </w:r>
+    </w:p>
+    <w:p>
+      <w:pPr>
         <w:pStyle w:val="Heading2"/>
         <w:jc w:val="right"/>
         <w:bidi w:val="1"/>
@@ -9286,6 +9322,120 @@
           <w:b/>
         </w:rPr>
         <w:t>8.1 מצבי פעולה</w:t>
+      </w:r>
+    </w:p>
+    <w:p>
+      <w:pPr>
+        <w:jc w:val="right"/>
+        <w:bidi w:val="1"/>
+      </w:pPr>
+      <w:r>
+        <w:rPr>
+          <w:rFonts w:ascii="Arial" w:hAnsi="Arial" w:cs="Arial"/>
+        </w:rPr>
+        <w:t>רכישה ישירה מתוך האתר היא דרישת חובה בגרסה הראשונה. כפתור קנייה אינו מסתפק בהפניה לאתר חיצוני: המשתמש מקבל הצעת מחיר, מאשר רכישה באתר, והשרת שולח הזמנה לרשם באמצעות API. האוטומציה של החיפוש אינה הרשאה להוציא כסף; רכישה מתבצעת באישור המשתמש או מכוח כלל Auto-buy שהופעל בנפרד.</w:t>
+      </w:r>
+    </w:p>
+    <w:p>
+      <w:pPr>
+        <w:pStyle w:val="Heading3"/>
+        <w:jc w:val="right"/>
+        <w:bidi w:val="1"/>
+      </w:pPr>
+      <w:r>
+        <w:rPr>
+          <w:rFonts w:ascii="Arial" w:hAnsi="Arial" w:cs="Arial"/>
+          <w:b/>
+        </w:rPr>
+        <w:t>8.1.1 תהליך קנייה ישירה</w:t>
+      </w:r>
+    </w:p>
+    <w:p>
+      <w:pPr>
+        <w:jc w:val="right"/>
+        <w:bidi w:val="1"/>
+      </w:pPr>
+      <w:r>
+        <w:rPr>
+          <w:rFonts w:ascii="Arial" w:hAnsi="Arial" w:cs="Arial"/>
+        </w:rPr>
+        <w:t>בשלב ההקמה נשמרים פרטי בעל הדומיין ופרטי קשר תקינים בחשבון רשם בבעלות המשתמש או החברה. האתר מחובר לחשבון זה בהרשאה מתאימה. כספי הרכישה נגבים מהיתרה או מאמצעי התשלום שהרשם תומך בו; אם נדרשת טעינת יתרה, הדבר מוצג לפני אישור ההזמנה. אין להניח שכל רשם תומך בחיוב כרטיס דרך API.</w:t>
+      </w:r>
+    </w:p>
+    <w:p>
+      <w:pPr>
+        <w:jc w:val="right"/>
+        <w:bidi w:val="1"/>
+      </w:pPr>
+      <w:r>
+        <w:rPr>
+          <w:rFonts w:ascii="Arial" w:hAnsi="Arial" w:cs="Arial"/>
+        </w:rPr>
+        <w:t>בלחיצה על קנייה המערכת בודקת שוב זמינות, מחיר, מטבע, מסים ועמלות ככל שחלים, תקופת רישום, מחיר חידוש והאם חידוש אוטומטי מופעל. סכום כולל שלא ניתן לאמת חוסם השלמת הזמנה. המשתמש מאשר סכום סופי ופרטי בעלות; שינוי מחיר דורש הצעה חדשה. לאחר השליחה מוצגים מספר הזמנה, מצב ביצוע ותוצאה מאומתת.</w:t>
+      </w:r>
+    </w:p>
+    <w:p>
+      <w:pPr>
+        <w:jc w:val="right"/>
+        <w:bidi w:val="1"/>
+      </w:pPr>
+      <w:r>
+        <w:rPr>
+          <w:rFonts w:ascii="Arial" w:hAnsi="Arial" w:cs="Arial"/>
+        </w:rPr>
+        <w:t>הדומיין נחשב נרכש רק לאחר אישור הרשם ואימות שהוא מופיע בחשבון המיועד. לאחר רכישה מוצג במסך הדומיינים שלי: רשם, בעלים מיועדים, תאריך תפוגה, חידוש אוטומטי, מחיר חידוש וקישור לקבלה או לאסמכתה של הרשם. דרישת אימות כתובת דוא״ל מצד הרשם מוצגת כפעולה להשלמה ואינה מוסתרת.</w:t>
+      </w:r>
+    </w:p>
+    <w:p>
+      <w:pPr>
+        <w:pStyle w:val="Heading3"/>
+        <w:jc w:val="right"/>
+        <w:bidi w:val="1"/>
+      </w:pPr>
+      <w:r>
+        <w:rPr>
+          <w:rFonts w:ascii="Arial" w:hAnsi="Arial" w:cs="Arial"/>
+          <w:b/>
+        </w:rPr>
+        <w:t>8.1.2 מסלולי רכישה</w:t>
+      </w:r>
+    </w:p>
+    <w:p>
+      <w:pPr>
+        <w:jc w:val="right"/>
+        <w:bidi w:val="1"/>
+      </w:pPr>
+      <w:r>
+        <w:rPr>
+          <w:rFonts w:ascii="Arial" w:hAnsi="Arial" w:cs="Arial"/>
+        </w:rPr>
+        <w:t>פנוי לרישום: רישום ישיר דרך API. Closeout: קנייה במחיר קבוע דרך API נתמך. מכרז: הצעת מחיר באתר רק כשיש API נתמך והרשאה לתקרת ההצעה; זכייה ומסירה הן שלבים נפרדים. Backorder: הזמנת ניסיון תפיסה, ללא הבטחת הצלחה. דומיין רשום שאינו מוצע למכירה: מעקב בלבד. פעולה שאינה נתמכת באינטגרציה מסומנת כלא זמינה לרכישה ישירה ולא מוצגת כאילו בוצעה.</w:t>
+      </w:r>
+    </w:p>
+    <w:p>
+      <w:pPr>
+        <w:pStyle w:val="Heading3"/>
+        <w:jc w:val="right"/>
+        <w:bidi w:val="1"/>
+      </w:pPr>
+      <w:r>
+        <w:rPr>
+          <w:rFonts w:ascii="Arial" w:hAnsi="Arial" w:cs="Arial"/>
+          <w:b/>
+        </w:rPr>
+        <w:t>8.1.3 עקביות כספית</w:t>
+      </w:r>
+    </w:p>
+    <w:p>
+      <w:pPr>
+        <w:jc w:val="right"/>
+        <w:bidi w:val="1"/>
+      </w:pPr>
+      <w:r>
+        <w:rPr>
+          <w:rFonts w:ascii="Arial" w:hAnsi="Arial" w:cs="Arial"/>
+        </w:rPr>
+        <w:t>לפני פעולה כספית נעולים הדומיין והתקציב ונשמרת הזמנה פנימית אחת. סכומים שמורים והתחייבויות במכרז נספרים בתקציב. מזהה פנימי אינו מבטיח שהרשם תומך במניעת כפילות: לאחר Timeout המצב הוא לא ידוע ויש לבדוק הזמנות ובעלות לפני שליחה נוספת. אין ניסיון אצל רשם שני בעוד הפעולה הראשונה לא הוכרעה. כשל משחרר תקציב רק לאחר בירור; חיוב או החזר מוצגים לפי אסמכתה מהספק.</w:t>
       </w:r>
     </w:p>
     <w:tbl>
@@ -16684,7 +16834,7 @@
         <w:rPr>
           <w:rFonts w:ascii="Arial" w:hAnsi="Arial" w:cs="Arial"/>
         </w:rPr>
-        <w:t>חיפוש בסיומות .com, .net ו-.org.</w:t>
+        <w:t>חיפוש בכל התחומים ובכל הסיומות הנתמכות במקורות המחוברים, ללא רשימת סיומות קשיחה.</w:t>
       </w:r>
     </w:p>
     <w:p>
@@ -16794,7 +16944,7 @@
         <w:rPr>
           <w:rFonts w:ascii="Arial" w:hAnsi="Arial" w:cs="Arial"/>
         </w:rPr>
-        <w:t>מצבי Monitor, Notify ו-Approval.</w:t>
+        <w:t>מצבי Monitor, Notify ו-Approval, כולל השלמת קנייה ישירה של דומיין פנוי מתוך האתר באמצעות API של רשם מחובר.</w:t>
       </w:r>
     </w:p>
     <w:p>
@@ -18134,6 +18284,30 @@
     </w:p>
     <w:p>
       <w:pPr>
+        <w:jc w:val="right"/>
+        <w:bidi w:val="1"/>
+      </w:pPr>
+      <w:r>
+        <w:rPr>
+          <w:rFonts w:ascii="Arial" w:hAnsi="Arial" w:cs="Arial"/>
+        </w:rPr>
+        <w:t>AC-13: פקודה ללא תחום ומילות מפתח מפעילה חיפוש כלל-תחומי; נתוני בדיקה מענפים שונים נותרים מועמדים. AC-14: המערכת מציגה כיסוי מקורות וסיומות וחוסרים. AC-15: דומיינים חדשים שלא נרשמו בעבר מוצגים בנפרד מדומיינים שפג תוקפם; בחיפוש כללי נבדק מאגר מועמדים מוגדר ולא נטען שכל צירופי השמות נסרקו.</w:t>
+      </w:r>
+    </w:p>
+    <w:p>
+      <w:pPr>
+        <w:jc w:val="right"/>
+        <w:bidi w:val="1"/>
+      </w:pPr>
+      <w:r>
+        <w:rPr>
+          <w:rFonts w:ascii="Arial" w:hAnsi="Arial" w:cs="Arial"/>
+        </w:rPr>
+        <w:t>AC-16: משתמש מאשר באתר רכישה של דומיין פנוי; נשלחת הזמנה אמיתית לרשם, ומוצגים אישור ספק ואימות הופעה בחשבון. AC-17: כפתור הקנייה אינו רק קישור חיצוני. AC-18: כפל לחיצה או Timeout אינם גורמים להזמנה חוזרת ללא בירור. AC-19: יתרה לא מספקת, שינוי מחיר או פרטי בעלות חסרים מונעים שליחה ומציגים פתרון ברור. בדיקות פיתוח מתבצעות בסביבת Sandbox; בדיקת רכישה אמיתית זולה תיעשה רק לאחר הרשאה מפורשת ותקציב מוגדר.</w:t>
+      </w:r>
+    </w:p>
+    <w:p>
+      <w:pPr>
         <w:pStyle w:val="Heading1"/>
         <w:jc w:val="right"/>
         <w:bidi w:val="1"/>
@@ -18185,7 +18359,7 @@
         <w:rPr>
           <w:rFonts w:ascii="Arial" w:hAnsi="Arial" w:cs="Arial"/>
         </w:rPr>
-        <w:t>המשתמש כותב: “מצא לי דומיינים קצרים בתחום הוויזות באנגלית, רק com, במשך שבועיים”.</w:t>
+        <w:t>המשתמש כותב: “מצא לי דומיינים בהזדמנות לקנייה בכל התחומים ובכל הסיומות הנתמכות, במשך שבועיים”.</w:t>
       </w:r>
     </w:p>
     <w:p>
@@ -18768,7 +18942,7 @@
                 <w:color w:val="17202A"/>
                 <w:sz w:val="17"/>
               </w:rPr>
-              <w:t>.com, .net, .org</w:t>
+              <w:t>כל הסיומות שמספקים המקורות המחוברים</w:t>
             </w:r>
           </w:p>
         </w:tc>

</xml_diff>